<commit_message>
Add: New itd act
</commit_message>
<xml_diff>
--- a/templates/itd/Разрешение на монтаж технических средств автоматизации.docx
+++ b/templates/itd/Разрешение на монтаж технических средств автоматизации.docx
@@ -41,7 +41,7 @@
           <w:p>
             <w:pPr>
               <w:pStyle w:val="Normal"/>
-              <w:overflowPunct w:val="false"/>
+              <w:overflowPunct w:val="true"/>
               <w:textAlignment w:val="auto"/>
               <w:rPr>
                 <w:sz w:val="22"/>
@@ -68,7 +68,7 @@
           <w:p>
             <w:pPr>
               <w:pStyle w:val="Normal"/>
-              <w:overflowPunct w:val="false"/>
+              <w:overflowPunct w:val="true"/>
               <w:textAlignment w:val="auto"/>
               <w:rPr>
                 <w:sz w:val="22"/>
@@ -95,7 +95,7 @@
           <w:p>
             <w:pPr>
               <w:pStyle w:val="Normal"/>
-              <w:overflowPunct w:val="false"/>
+              <w:overflowPunct w:val="true"/>
               <w:textAlignment w:val="auto"/>
               <w:rPr>
                 <w:sz w:val="22"/>
@@ -126,7 +126,7 @@
           <w:p>
             <w:pPr>
               <w:pStyle w:val="Normal"/>
-              <w:overflowPunct w:val="false"/>
+              <w:overflowPunct w:val="true"/>
               <w:textAlignment w:val="auto"/>
               <w:rPr>
                 <w:sz w:val="22"/>
@@ -151,7 +151,7 @@
           <w:p>
             <w:pPr>
               <w:pStyle w:val="Normal"/>
-              <w:overflowPunct w:val="false"/>
+              <w:overflowPunct w:val="true"/>
               <w:textAlignment w:val="auto"/>
               <w:rPr>
                 <w:sz w:val="22"/>
@@ -178,7 +178,7 @@
           <w:p>
             <w:pPr>
               <w:pStyle w:val="Normal"/>
-              <w:overflowPunct w:val="false"/>
+              <w:overflowPunct w:val="true"/>
               <w:textAlignment w:val="auto"/>
               <w:rPr>
                 <w:sz w:val="22"/>
@@ -209,7 +209,7 @@
           <w:p>
             <w:pPr>
               <w:pStyle w:val="Normal"/>
-              <w:overflowPunct w:val="false"/>
+              <w:overflowPunct w:val="true"/>
               <w:textAlignment w:val="auto"/>
               <w:rPr>
                 <w:sz w:val="22"/>
@@ -240,7 +240,7 @@
           <w:p>
             <w:pPr>
               <w:pStyle w:val="Normal"/>
-              <w:overflowPunct w:val="false"/>
+              <w:overflowPunct w:val="true"/>
               <w:jc w:val="center"/>
               <w:textAlignment w:val="auto"/>
               <w:rPr>
@@ -277,7 +277,7 @@
           <w:p>
             <w:pPr>
               <w:pStyle w:val="Normal"/>
-              <w:overflowPunct w:val="false"/>
+              <w:overflowPunct w:val="true"/>
               <w:jc w:val="center"/>
               <w:textAlignment w:val="auto"/>
               <w:rPr>
@@ -314,7 +314,7 @@
           <w:p>
             <w:pPr>
               <w:pStyle w:val="Normal"/>
-              <w:overflowPunct w:val="false"/>
+              <w:overflowPunct w:val="true"/>
               <w:jc w:val="center"/>
               <w:textAlignment w:val="auto"/>
               <w:rPr>
@@ -349,7 +349,7 @@
           <w:p>
             <w:pPr>
               <w:pStyle w:val="Normal"/>
-              <w:overflowPunct w:val="false"/>
+              <w:overflowPunct w:val="true"/>
               <w:textAlignment w:val="auto"/>
               <w:rPr>
                 <w:sz w:val="22"/>
@@ -378,7 +378,7 @@
           <w:p>
             <w:pPr>
               <w:pStyle w:val="Normal"/>
-              <w:overflowPunct w:val="false"/>
+              <w:overflowPunct w:val="true"/>
               <w:jc w:val="center"/>
               <w:textAlignment w:val="auto"/>
               <w:rPr>
@@ -413,7 +413,7 @@
           <w:p>
             <w:pPr>
               <w:pStyle w:val="Normal"/>
-              <w:overflowPunct w:val="false"/>
+              <w:overflowPunct w:val="true"/>
               <w:textAlignment w:val="auto"/>
               <w:rPr>
                 <w:sz w:val="22"/>
@@ -441,7 +441,7 @@
           <w:p>
             <w:pPr>
               <w:pStyle w:val="Normal"/>
-              <w:overflowPunct w:val="false"/>
+              <w:overflowPunct w:val="true"/>
               <w:jc w:val="center"/>
               <w:textAlignment w:val="auto"/>
               <w:rPr>
@@ -472,7 +472,7 @@
           <w:p>
             <w:pPr>
               <w:pStyle w:val="Normal"/>
-              <w:overflowPunct w:val="false"/>
+              <w:overflowPunct w:val="true"/>
               <w:textAlignment w:val="auto"/>
               <w:rPr>
                 <w:sz w:val="22"/>
@@ -504,7 +504,7 @@
           <w:p>
             <w:pPr>
               <w:pStyle w:val="Normal"/>
-              <w:overflowPunct w:val="false"/>
+              <w:overflowPunct w:val="true"/>
               <w:textAlignment w:val="auto"/>
               <w:rPr>
                 <w:sz w:val="22"/>
@@ -535,7 +535,7 @@
           <w:p>
             <w:pPr>
               <w:pStyle w:val="Normal"/>
-              <w:overflowPunct w:val="false"/>
+              <w:overflowPunct w:val="true"/>
               <w:textAlignment w:val="auto"/>
               <w:rPr>
                 <w:sz w:val="22"/>
@@ -564,7 +564,7 @@
           <w:p>
             <w:pPr>
               <w:pStyle w:val="Normal"/>
-              <w:overflowPunct w:val="false"/>
+              <w:overflowPunct w:val="true"/>
               <w:jc w:val="center"/>
               <w:textAlignment w:val="auto"/>
               <w:rPr>
@@ -605,7 +605,7 @@
           <w:p>
             <w:pPr>
               <w:pStyle w:val="Normal"/>
-              <w:overflowPunct w:val="false"/>
+              <w:overflowPunct w:val="true"/>
               <w:textAlignment w:val="auto"/>
               <w:rPr>
                 <w:sz w:val="22"/>
@@ -634,7 +634,7 @@
           <w:p>
             <w:pPr>
               <w:pStyle w:val="Normal"/>
-              <w:overflowPunct w:val="false"/>
+              <w:overflowPunct w:val="true"/>
               <w:jc w:val="center"/>
               <w:textAlignment w:val="auto"/>
               <w:rPr>
@@ -675,7 +675,7 @@
           <w:p>
             <w:pPr>
               <w:pStyle w:val="Normal"/>
-              <w:overflowPunct w:val="false"/>
+              <w:overflowPunct w:val="true"/>
               <w:textAlignment w:val="auto"/>
               <w:rPr>
                 <w:sz w:val="22"/>
@@ -707,7 +707,7 @@
           <w:p>
             <w:pPr>
               <w:pStyle w:val="Normal"/>
-              <w:overflowPunct w:val="false"/>
+              <w:overflowPunct w:val="true"/>
               <w:textAlignment w:val="auto"/>
               <w:rPr>
                 <w:sz w:val="22"/>
@@ -736,7 +736,7 @@
           <w:p>
             <w:pPr>
               <w:pStyle w:val="Normal"/>
-              <w:overflowPunct w:val="false"/>
+              <w:overflowPunct w:val="true"/>
               <w:jc w:val="center"/>
               <w:textAlignment w:val="auto"/>
               <w:rPr>
@@ -765,7 +765,7 @@
                 <w:sz w:val="22"/>
                 <w:szCs w:val="22"/>
               </w:rPr>
-              <w:t>customer</w:t>
+              <w:t>techsupervision</w:t>
             </w:r>
             <w:r>
               <w:rPr>
@@ -795,7 +795,7 @@
           <w:p>
             <w:pPr>
               <w:pStyle w:val="Normal"/>
-              <w:overflowPunct w:val="false"/>
+              <w:overflowPunct w:val="true"/>
               <w:textAlignment w:val="auto"/>
               <w:rPr>
                 <w:sz w:val="22"/>
@@ -827,7 +827,7 @@
           <w:p>
             <w:pPr>
               <w:pStyle w:val="Normal"/>
-              <w:overflowPunct w:val="false"/>
+              <w:overflowPunct w:val="true"/>
               <w:textAlignment w:val="auto"/>
               <w:rPr>
                 <w:b/>
@@ -861,7 +861,7 @@
           <w:p>
             <w:pPr>
               <w:pStyle w:val="Normal"/>
-              <w:overflowPunct w:val="false"/>
+              <w:overflowPunct w:val="true"/>
               <w:jc w:val="center"/>
               <w:textAlignment w:val="auto"/>
               <w:rPr>
@@ -898,7 +898,7 @@
           <w:p>
             <w:pPr>
               <w:pStyle w:val="Normal"/>
-              <w:overflowPunct w:val="false"/>
+              <w:overflowPunct w:val="true"/>
               <w:textAlignment w:val="auto"/>
               <w:rPr>
                 <w:sz w:val="22"/>
@@ -930,7 +930,7 @@
           <w:p>
             <w:pPr>
               <w:pStyle w:val="Normal"/>
-              <w:overflowPunct w:val="false"/>
+              <w:overflowPunct w:val="true"/>
               <w:textAlignment w:val="auto"/>
               <w:rPr>
                 <w:sz w:val="22"/>
@@ -965,7 +965,7 @@
           <w:p>
             <w:pPr>
               <w:pStyle w:val="Normal"/>
-              <w:overflowPunct w:val="false"/>
+              <w:overflowPunct w:val="true"/>
               <w:jc w:val="center"/>
               <w:textAlignment w:val="auto"/>
               <w:rPr>
@@ -1004,7 +1004,7 @@
           <w:p>
             <w:pPr>
               <w:pStyle w:val="Normal"/>
-              <w:overflowPunct w:val="false"/>
+              <w:overflowPunct w:val="true"/>
               <w:textAlignment w:val="auto"/>
               <w:rPr>
                 <w:b/>
@@ -1038,7 +1038,7 @@
           <w:p>
             <w:pPr>
               <w:pStyle w:val="Normal"/>
-              <w:overflowPunct w:val="false"/>
+              <w:overflowPunct w:val="true"/>
               <w:jc w:val="center"/>
               <w:textAlignment w:val="auto"/>
               <w:rPr>
@@ -1075,7 +1075,7 @@
           <w:p>
             <w:pPr>
               <w:pStyle w:val="Normal"/>
-              <w:overflowPunct w:val="false"/>
+              <w:overflowPunct w:val="true"/>
               <w:textAlignment w:val="auto"/>
               <w:rPr>
                 <w:sz w:val="22"/>
@@ -1107,7 +1107,7 @@
           <w:p>
             <w:pPr>
               <w:pStyle w:val="Normal"/>
-              <w:overflowPunct w:val="false"/>
+              <w:overflowPunct w:val="true"/>
               <w:jc w:val="both"/>
               <w:textAlignment w:val="auto"/>
               <w:rPr>
@@ -1144,7 +1144,7 @@
           <w:p>
             <w:pPr>
               <w:pStyle w:val="Normal"/>
-              <w:overflowPunct w:val="false"/>
+              <w:overflowPunct w:val="true"/>
               <w:jc w:val="both"/>
               <w:textAlignment w:val="auto"/>
               <w:rPr>
@@ -1181,7 +1181,7 @@
           <w:p>
             <w:pPr>
               <w:pStyle w:val="Normal"/>
-              <w:overflowPunct w:val="false"/>
+              <w:overflowPunct w:val="true"/>
               <w:jc w:val="both"/>
               <w:textAlignment w:val="auto"/>
               <w:rPr>
@@ -1226,7 +1226,7 @@
           <w:p>
             <w:pPr>
               <w:pStyle w:val="Normal"/>
-              <w:overflowPunct w:val="false"/>
+              <w:overflowPunct w:val="true"/>
               <w:jc w:val="center"/>
               <w:textAlignment w:val="auto"/>
               <w:rPr>
@@ -1261,7 +1261,7 @@
           <w:p>
             <w:pPr>
               <w:pStyle w:val="Normal"/>
-              <w:overflowPunct w:val="false"/>
+              <w:overflowPunct w:val="true"/>
               <w:jc w:val="center"/>
               <w:textAlignment w:val="auto"/>
               <w:rPr>
@@ -1301,7 +1301,7 @@
           <w:p>
             <w:pPr>
               <w:pStyle w:val="Normal"/>
-              <w:overflowPunct w:val="false"/>
+              <w:overflowPunct w:val="true"/>
               <w:textAlignment w:val="auto"/>
               <w:rPr>
                 <w:b/>
@@ -1340,7 +1340,7 @@
           <w:p>
             <w:pPr>
               <w:pStyle w:val="Normal"/>
-              <w:overflowPunct w:val="false"/>
+              <w:overflowPunct w:val="true"/>
               <w:textAlignment w:val="auto"/>
               <w:rPr>
                 <w:sz w:val="22"/>
@@ -1372,7 +1372,7 @@
           <w:p>
             <w:pPr>
               <w:pStyle w:val="Normal"/>
-              <w:overflowPunct w:val="false"/>
+              <w:overflowPunct w:val="true"/>
               <w:textAlignment w:val="auto"/>
               <w:rPr>
                 <w:sz w:val="22"/>
@@ -1401,7 +1401,7 @@
           <w:p>
             <w:pPr>
               <w:pStyle w:val="Normal"/>
-              <w:overflowPunct w:val="false"/>
+              <w:overflowPunct w:val="true"/>
               <w:jc w:val="center"/>
               <w:textAlignment w:val="auto"/>
               <w:rPr>
@@ -1418,7 +1418,64 @@
                 <w:sz w:val="22"/>
                 <w:szCs w:val="22"/>
               </w:rPr>
-              <w:t>{customer_rep_pos} {customer_rep_org} {customer_rep_short_fio}</w:t>
+              <w:t>{</w:t>
+            </w:r>
+            <w:r>
+              <w:rPr>
+                <w:b/>
+                <w:i/>
+                <w:iCs/>
+                <w:sz w:val="22"/>
+                <w:szCs w:val="22"/>
+              </w:rPr>
+              <w:t>techsupervision</w:t>
+            </w:r>
+            <w:r>
+              <w:rPr>
+                <w:b/>
+                <w:i/>
+                <w:sz w:val="22"/>
+                <w:szCs w:val="22"/>
+              </w:rPr>
+              <w:t>_rep_pos} {</w:t>
+            </w:r>
+            <w:r>
+              <w:rPr>
+                <w:b/>
+                <w:i/>
+                <w:iCs/>
+                <w:sz w:val="22"/>
+                <w:szCs w:val="22"/>
+              </w:rPr>
+              <w:t>techsupervision</w:t>
+            </w:r>
+            <w:r>
+              <w:rPr>
+                <w:b/>
+                <w:i/>
+                <w:sz w:val="22"/>
+                <w:szCs w:val="22"/>
+              </w:rPr>
+              <w:t>_rep_org} {</w:t>
+            </w:r>
+            <w:r>
+              <w:rPr>
+                <w:b/>
+                <w:i/>
+                <w:iCs/>
+                <w:sz w:val="22"/>
+                <w:szCs w:val="22"/>
+              </w:rPr>
+              <w:t>techsupervision</w:t>
+            </w:r>
+            <w:r>
+              <w:rPr>
+                <w:b/>
+                <w:i/>
+                <w:sz w:val="22"/>
+                <w:szCs w:val="22"/>
+              </w:rPr>
+              <w:t>_rep_short_fio}</w:t>
             </w:r>
           </w:p>
         </w:tc>
@@ -1438,7 +1495,7 @@
           <w:p>
             <w:pPr>
               <w:pStyle w:val="Normal"/>
-              <w:overflowPunct w:val="false"/>
+              <w:overflowPunct w:val="true"/>
               <w:textAlignment w:val="auto"/>
               <w:rPr>
                 <w:i/>
@@ -1468,7 +1525,7 @@
           <w:p>
             <w:pPr>
               <w:pStyle w:val="Normal"/>
-              <w:overflowPunct w:val="false"/>
+              <w:overflowPunct w:val="true"/>
               <w:jc w:val="center"/>
               <w:textAlignment w:val="auto"/>
               <w:rPr>
@@ -1505,7 +1562,7 @@
           <w:p>
             <w:pPr>
               <w:pStyle w:val="Normal"/>
-              <w:overflowPunct w:val="false"/>
+              <w:overflowPunct w:val="true"/>
               <w:textAlignment w:val="auto"/>
               <w:rPr>
                 <w:sz w:val="22"/>
@@ -1532,7 +1589,7 @@
           <w:p>
             <w:pPr>
               <w:pStyle w:val="Normal"/>
-              <w:overflowPunct w:val="false"/>
+              <w:overflowPunct w:val="true"/>
               <w:jc w:val="center"/>
               <w:textAlignment w:val="auto"/>
               <w:rPr>
@@ -1568,7 +1625,7 @@
           <w:p>
             <w:pPr>
               <w:pStyle w:val="Normal"/>
-              <w:overflowPunct w:val="false"/>
+              <w:overflowPunct w:val="true"/>
               <w:textAlignment w:val="auto"/>
               <w:rPr>
                 <w:sz w:val="22"/>
@@ -1595,7 +1652,7 @@
           <w:p>
             <w:pPr>
               <w:pStyle w:val="Normal"/>
-              <w:overflowPunct w:val="false"/>
+              <w:overflowPunct w:val="true"/>
               <w:jc w:val="center"/>
               <w:textAlignment w:val="auto"/>
               <w:rPr>
@@ -1631,7 +1688,7 @@
           <w:p>
             <w:pPr>
               <w:pStyle w:val="Normal"/>
-              <w:overflowPunct w:val="false"/>
+              <w:overflowPunct w:val="true"/>
               <w:textAlignment w:val="auto"/>
               <w:rPr>
                 <w:sz w:val="22"/>
@@ -1658,7 +1715,7 @@
           <w:p>
             <w:pPr>
               <w:pStyle w:val="Normal"/>
-              <w:overflowPunct w:val="false"/>
+              <w:overflowPunct w:val="true"/>
               <w:jc w:val="center"/>
               <w:textAlignment w:val="auto"/>
               <w:rPr>
@@ -1752,7 +1809,7 @@
           <w:p>
             <w:pPr>
               <w:pStyle w:val="Normal"/>
-              <w:overflowPunct w:val="false"/>
+              <w:overflowPunct w:val="true"/>
               <w:textAlignment w:val="auto"/>
               <w:rPr>
                 <w:i/>
@@ -1782,7 +1839,7 @@
           <w:p>
             <w:pPr>
               <w:pStyle w:val="Normal"/>
-              <w:overflowPunct w:val="false"/>
+              <w:overflowPunct w:val="true"/>
               <w:jc w:val="center"/>
               <w:textAlignment w:val="auto"/>
               <w:rPr>
@@ -1819,7 +1876,7 @@
           <w:p>
             <w:pPr>
               <w:pStyle w:val="Normal"/>
-              <w:overflowPunct w:val="false"/>
+              <w:overflowPunct w:val="true"/>
               <w:textAlignment w:val="auto"/>
               <w:rPr>
                 <w:sz w:val="22"/>
@@ -2020,7 +2077,7 @@
     <w:pPr>
       <w:widowControl/>
       <w:suppressAutoHyphens w:val="true"/>
-      <w:overflowPunct w:val="true"/>
+      <w:overflowPunct w:val="false"/>
       <w:bidi w:val="0"/>
       <w:spacing w:before="0" w:after="0"/>
       <w:jc w:val="start"/>
@@ -2045,7 +2102,7 @@
     <w:pPr>
       <w:keepNext w:val="true"/>
       <w:keepLines/>
-      <w:overflowPunct w:val="false"/>
+      <w:overflowPunct w:val="true"/>
       <w:spacing w:lineRule="auto" w:line="276" w:before="480" w:after="0"/>
       <w:textAlignment w:val="auto"/>
       <w:outlineLvl w:val="0"/>
@@ -2243,7 +2300,7 @@
       <w:pBdr>
         <w:bottom w:val="single" w:sz="8" w:space="4" w:color="4F81BD" w:themeColor="accent1"/>
       </w:pBdr>
-      <w:overflowPunct w:val="false"/>
+      <w:overflowPunct w:val="true"/>
       <w:spacing w:before="0" w:after="300"/>
       <w:contextualSpacing/>
       <w:textAlignment w:val="auto"/>
@@ -2266,7 +2323,7 @@
     <w:qFormat/>
     <w:rsid w:val="001c0119"/>
     <w:pPr>
-      <w:overflowPunct w:val="false"/>
+      <w:overflowPunct w:val="true"/>
       <w:spacing w:lineRule="auto" w:line="276" w:before="0" w:after="200"/>
       <w:textAlignment w:val="auto"/>
     </w:pPr>
@@ -2293,7 +2350,7 @@
       <w:pBdr>
         <w:bottom w:val="single" w:sz="4" w:space="4" w:color="4F81BD" w:themeColor="accent1"/>
       </w:pBdr>
-      <w:overflowPunct w:val="false"/>
+      <w:overflowPunct w:val="true"/>
       <w:spacing w:lineRule="auto" w:line="276" w:before="200" w:after="280"/>
       <w:ind w:start="936" w:end="936"/>
       <w:textAlignment w:val="auto"/>
@@ -2308,6 +2365,29 @@
       <w:sz w:val="22"/>
       <w:szCs w:val="22"/>
       <w:lang w:eastAsia="en-US"/>
+    </w:rPr>
+  </w:style>
+  <w:style w:type="paragraph" w:styleId="user2">
+    <w:name w:val="Содержимое таблицы (user)"/>
+    <w:basedOn w:val="Normal"/>
+    <w:qFormat/>
+    <w:pPr>
+      <w:widowControl w:val="false"/>
+      <w:suppressLineNumbers/>
+    </w:pPr>
+    <w:rPr/>
+  </w:style>
+  <w:style w:type="paragraph" w:styleId="user3">
+    <w:name w:val="Заголовок таблицы (user)"/>
+    <w:basedOn w:val="user2"/>
+    <w:qFormat/>
+    <w:pPr>
+      <w:suppressLineNumbers/>
+      <w:jc w:val="center"/>
+    </w:pPr>
+    <w:rPr>
+      <w:b/>
+      <w:bCs/>
     </w:rPr>
   </w:style>
   <w:style w:type="paragraph" w:styleId="Style18">
@@ -2333,31 +2413,8 @@
       <w:bCs/>
     </w:rPr>
   </w:style>
-  <w:style w:type="paragraph" w:styleId="user2">
-    <w:name w:val="Содержимое таблицы (user)"/>
-    <w:basedOn w:val="Normal"/>
-    <w:qFormat/>
-    <w:pPr>
-      <w:widowControl w:val="false"/>
-      <w:suppressLineNumbers/>
-    </w:pPr>
-    <w:rPr/>
-  </w:style>
-  <w:style w:type="paragraph" w:styleId="user3">
-    <w:name w:val="Заголовок таблицы (user)"/>
-    <w:basedOn w:val="user2"/>
-    <w:qFormat/>
-    <w:pPr>
-      <w:suppressLineNumbers/>
-      <w:jc w:val="center"/>
-    </w:pPr>
-    <w:rPr>
-      <w:b/>
-      <w:bCs/>
-    </w:rPr>
-  </w:style>
-  <w:style w:type="numbering" w:styleId="Style20" w:default="1">
-    <w:name w:val="Без списка"/>
+  <w:style w:type="numbering" w:styleId="user4" w:default="1">
+    <w:name w:val="Без списка (user)"/>
     <w:uiPriority w:val="99"/>
     <w:semiHidden/>
     <w:unhideWhenUsed/>

</xml_diff>